<commit_message>
fix: add svelte libaries to vite noExternal
</commit_message>
<xml_diff>
--- a/public/files/Will Hord-Resume.docx
+++ b/public/files/Will Hord-Resume.docx
@@ -39,7 +39,23 @@
           <w:sz w:val="20"/>
           <w:szCs w:val="20"/>
         </w:rPr>
-        <w:t xml:space="preserve">New York, NY • willhord@gmail.com • </w:t>
+        <w:t xml:space="preserve">New York, NY • </w:t>
+      </w:r>
+      <w:r>
+        <w:rPr>
+          <w:rFonts w:ascii="Calibri" w:hAnsi="Calibri" w:cs="Calibri"/>
+          <w:sz w:val="20"/>
+          <w:szCs w:val="20"/>
+        </w:rPr>
+        <w:t>contactwillhord</w:t>
+      </w:r>
+      <w:r>
+        <w:rPr>
+          <w:rFonts w:ascii="Calibri" w:hAnsi="Calibri" w:cs="Calibri"/>
+          <w:sz w:val="20"/>
+          <w:szCs w:val="20"/>
+        </w:rPr>
+        <w:t xml:space="preserve">@gmail.com • </w:t>
       </w:r>
       <w:proofErr w:type="spellStart"/>
       <w:r>
@@ -57,7 +73,7 @@
           <w:sz w:val="20"/>
           <w:szCs w:val="20"/>
         </w:rPr>
-        <w:t xml:space="preserve"> • github.com/</w:t>
+        <w:t xml:space="preserve"> • github.c</w:t>
       </w:r>
       <w:proofErr w:type="spellStart"/>
       <w:r>
@@ -66,7 +82,7 @@
           <w:sz w:val="20"/>
           <w:szCs w:val="20"/>
         </w:rPr>
-        <w:t>WillHord</w:t>
+        <w:t>om/WillHord</w:t>
       </w:r>
       <w:proofErr w:type="spellEnd"/>
     </w:p>

</xml_diff>